<commit_message>
Deploy preview for PR 578 🛫
</commit_message>
<xml_diff>
--- a/pr-preview/pr-578/vignettes/articles/version-crosswalk-1.3-to-1.4.docx
+++ b/pr-preview/pr-578/vignettes/articles/version-crosswalk-1.3-to-1.4.docx
@@ -3049,7 +3049,7 @@
         <w:rPr>
           <w:rStyle w:val="CommentTok"/>
         </w:rPr>
-        <w:t xml:space="preserve">#&gt;     age id    antigen_iso  value</w:t>
+        <w:t xml:space="preserve">#&gt;     age id    antigen_iso value</w:t>
       </w:r>
       <w:r>
         <w:br/>
@@ -3058,7 +3058,7 @@
         <w:rPr>
           <w:rStyle w:val="CommentTok"/>
         </w:rPr>
-        <w:t xml:space="preserve">#&gt;   &lt;dbl&gt; &lt;chr&gt; &lt;chr&gt;        &lt;dbl&gt;</w:t>
+        <w:t xml:space="preserve">#&gt;   &lt;dbl&gt; &lt;chr&gt; &lt;chr&gt;       &lt;dbl&gt;</w:t>
       </w:r>
       <w:r>
         <w:br/>
@@ -3067,7 +3067,7 @@
         <w:rPr>
           <w:rStyle w:val="CommentTok"/>
         </w:rPr>
-        <w:t xml:space="preserve">#&gt; 1  8.27 1     HlyE_IgA     2.36 </w:t>
+        <w:t xml:space="preserve">#&gt; 1 15.0  1     HlyE_IgA    0.671</w:t>
       </w:r>
       <w:r>
         <w:br/>
@@ -3076,7 +3076,7 @@
         <w:rPr>
           <w:rStyle w:val="CommentTok"/>
         </w:rPr>
-        <w:t xml:space="preserve">#&gt; 2  8.27 1     HlyE_IgG    23.2  </w:t>
+        <w:t xml:space="preserve">#&gt; 2 15.0  1     HlyE_IgG    0.352</w:t>
       </w:r>
       <w:r>
         <w:br/>
@@ -3085,7 +3085,7 @@
         <w:rPr>
           <w:rStyle w:val="CommentTok"/>
         </w:rPr>
-        <w:t xml:space="preserve">#&gt; 3  4.1  2     HlyE_IgA     1.79 </w:t>
+        <w:t xml:space="preserve">#&gt; 3  9.91 2     HlyE_IgA    1.86 </w:t>
       </w:r>
       <w:r>
         <w:br/>
@@ -3094,7 +3094,7 @@
         <w:rPr>
           <w:rStyle w:val="CommentTok"/>
         </w:rPr>
-        <w:t xml:space="preserve">#&gt; 4  4.1  2     HlyE_IgG     2.81 </w:t>
+        <w:t xml:space="preserve">#&gt; 4  9.91 2     HlyE_IgG    1.00 </w:t>
       </w:r>
       <w:r>
         <w:br/>
@@ -3103,7 +3103,7 @@
         <w:rPr>
           <w:rStyle w:val="CommentTok"/>
         </w:rPr>
-        <w:t xml:space="preserve">#&gt; 5  6.49 3     HlyE_IgA     0.733</w:t>
+        <w:t xml:space="preserve">#&gt; 5  1.87 3     HlyE_IgA    0.413</w:t>
       </w:r>
       <w:r>
         <w:br/>
@@ -3112,7 +3112,7 @@
         <w:rPr>
           <w:rStyle w:val="CommentTok"/>
         </w:rPr>
-        <w:t xml:space="preserve">#&gt; 6  6.49 3     HlyE_IgG     0.522</w:t>
+        <w:t xml:space="preserve">#&gt; 6  1.87 3     HlyE_IgG    0.440</w:t>
       </w:r>
       <w:r>
         <w:br/>

</xml_diff>